<commit_message>
Portfolio 3D book + pages about/skills/projects/interests/contact
</commit_message>
<xml_diff>
--- a/CV_ABOUBAKAR_MOHAMAN.docx
+++ b/CV_ABOUBAKAR_MOHAMAN.docx
@@ -9,13 +9,13 @@
         <w:tblLook w:firstColumn="1" w:firstRow="1" w:lastColumn="0" w:lastRow="0" w:noHBand="0" w:noVBand="1" w:val="04A0"/>
       </w:tblPr>
       <w:tblGrid>
-        <w:gridCol w:w="4819"/>
-        <w:gridCol w:w="4819"/>
+        <w:gridCol w:w="4153"/>
+        <w:gridCol w:w="4153"/>
       </w:tblGrid>
       <w:tr>
         <w:tc>
           <w:tcPr>
-            <w:tcW w:type="dxa" w:w="6803"/>
+            <w:tcW w:type="dxa" w:w="7370"/>
             <w:tcBorders>
               <w:top w:val="nil"/>
               <w:left w:val="nil"/>
@@ -40,42 +40,42 @@
             <w:r>
               <w:rPr>
                 <w:color w:val="555555"/>
-                <w:sz w:val="26"/>
+                <w:sz w:val="24"/>
               </w:rPr>
-              <w:t>Étudiant en Génie Informatique</w:t>
+              <w:t>Etudiant en Genie Informatique — IUT de Douala</w:t>
             </w:r>
           </w:p>
           <w:p>
             <w:r>
               <w:rPr>
-                <w:sz w:val="20"/>
+                <w:sz w:val="19"/>
               </w:rPr>
-              <w:t>📧 aboubakar.mohaman@sfaedu.org</w:t>
+              <w:t>aboubakar.mohaman@sfaedu.org</w:t>
             </w:r>
           </w:p>
           <w:p>
             <w:r>
               <w:rPr>
-                <w:sz w:val="20"/>
+                <w:sz w:val="19"/>
               </w:rPr>
-              <w:t>📞 +237 681 369 973</w:t>
+              <w:t>+237 681 369 973</w:t>
             </w:r>
           </w:p>
           <w:p>
             <w:r>
               <w:rPr>
-                <w:sz w:val="20"/>
+                <w:sz w:val="19"/>
               </w:rPr>
-              <w:t>📍 Douala, Cameroun</w:t>
+              <w:t>Douala, Cameroun</w:t>
             </w:r>
           </w:p>
           <w:p>
             <w:r>
               <w:rPr>
                 <w:color w:val="0F3460"/>
-                <w:sz w:val="20"/>
+                <w:sz w:val="19"/>
               </w:rPr>
-              <w:t>🔗 github.com/AB-cloud-cyber</w:t>
+              <w:t>github.com/AB-cloud-cyber</w:t>
             </w:r>
           </w:p>
         </w:tc>
@@ -96,7 +96,7 @@
             <w:r>
               <w:drawing>
                 <wp:inline xmlns:a="http://schemas.openxmlformats.org/drawingml/2006/main" xmlns:pic="http://schemas.openxmlformats.org/drawingml/2006/picture">
-                  <wp:extent cx="1260000" cy="2187680"/>
+                  <wp:extent cx="1152000" cy="2000165"/>
                   <wp:docPr id="1" name="Picture 1"/>
                   <wp:cNvGraphicFramePr>
                     <a:graphicFrameLocks noChangeAspect="1"/>
@@ -117,7 +117,7 @@
                         <pic:spPr>
                           <a:xfrm>
                             <a:off x="0" y="0"/>
-                            <a:ext cx="1260000" cy="2187680"/>
+                            <a:ext cx="1152000" cy="2000165"/>
                           </a:xfrm>
                           <a:prstGeom prst="rect"/>
                         </pic:spPr>
@@ -132,38 +132,42 @@
       </w:tr>
     </w:tbl>
     <w:p>
+      <w:pPr>
+        <w:pBdr>
+          <w:bottom w:val="single" w:sz="6" w:space="1" w:color="0F3460"/>
+        </w:pBdr>
+      </w:pPr>
       <w:r>
         <w:rPr>
           <w:b/>
           <w:color w:val="0F3460"/>
-          <w:sz w:val="28"/>
+          <w:sz w:val="26"/>
         </w:rPr>
         <w:t>PROFIL</w:t>
       </w:r>
-      <w:pBdr>
-        <w:bottom w:val="single" w:sz="6" w:space="1" w:color="0F3460"/>
-      </w:pBdr>
     </w:p>
     <w:p>
       <w:r>
         <w:rPr>
           <w:sz w:val="20"/>
         </w:rPr>
-        <w:t>Étudiant en 1ʳᵉ année de Génie Informatique à l'IUT de Douala, passionné par le développement d'applications web, l'intelligence artificielle et l'analyse de données. Membre actif de Striving For All (SFA), je maîtrise Python, Flask, React, PostgreSQL et les outils de data science. Je cherche un stage en IA et Data pour mettre en pratique mes compétences et contribuer à des projets innovants.</w:t>
+        <w:t>Etudiant en 1re annee de Genie Informatique a l'IUT de Douala, passionne par le developpement d'applications web, l'intelligence artificielle et l'analyse de donnees. Membre actif de Striving For All (SFA), je maitrise Python, Flask, React, PostgreSQL et les outils de data science. Je cherche un stage en IA et Data pour mettre en pratique mes competences et contribuer a des projets innovants.</w:t>
       </w:r>
     </w:p>
     <w:p>
+      <w:pPr>
+        <w:pBdr>
+          <w:bottom w:val="single" w:sz="6" w:space="1" w:color="0F3460"/>
+        </w:pBdr>
+      </w:pPr>
       <w:r>
         <w:rPr>
           <w:b/>
           <w:color w:val="0F3460"/>
-          <w:sz w:val="28"/>
+          <w:sz w:val="26"/>
         </w:rPr>
         <w:t>FORMATION</w:t>
       </w:r>
-      <w:pBdr>
-        <w:bottom w:val="single" w:sz="6" w:space="1" w:color="0F3460"/>
-      </w:pBdr>
     </w:p>
     <w:p>
       <w:r>
@@ -171,23 +175,21 @@
           <w:b/>
           <w:sz w:val="22"/>
         </w:rPr>
-        <w:t>1ʳᵉ Année Génie Informatique</w:t>
+        <w:t>1re Annee Genie Informatique</w:t>
       </w:r>
-      <w:r>
-        <w:rPr>
-          <w:color w:val="888888"/>
-          <w:sz w:val="20"/>
-        </w:rPr>
-        <w:t xml:space="preserve">  |  2025 - 2026</w:t>
-      </w:r>
-    </w:p>
-    <w:p>
       <w:r>
         <w:rPr>
           <w:color w:val="555555"/>
           <w:sz w:val="20"/>
         </w:rPr>
-        <w:t>IUT de Douala — Université de Douala</w:t>
+        <w:t xml:space="preserve"> — IUT de Douala — Universite de Douala</w:t>
+      </w:r>
+      <w:r>
+        <w:rPr>
+          <w:color w:val="888888"/>
+          <w:sz w:val="18"/>
+        </w:rPr>
+        <w:t xml:space="preserve">   2025 - 2026</w:t>
       </w:r>
     </w:p>
     <w:p>
@@ -201,9 +203,9 @@
       <w:r>
         <w:rPr>
           <w:color w:val="888888"/>
-          <w:sz w:val="20"/>
+          <w:sz w:val="18"/>
         </w:rPr>
-        <w:t xml:space="preserve">  |  2025 - 2026</w:t>
+        <w:t xml:space="preserve">   2025 - 2026</w:t>
       </w:r>
     </w:p>
     <w:p>
@@ -236,7 +238,7 @@
         <w:rPr>
           <w:sz w:val="20"/>
         </w:rPr>
-        <w:t>Développement Web</w:t>
+        <w:t>Developpement Web</w:t>
       </w:r>
     </w:p>
     <w:p>
@@ -262,17 +264,19 @@
       </w:r>
     </w:p>
     <w:p>
+      <w:pPr>
+        <w:pBdr>
+          <w:bottom w:val="single" w:sz="6" w:space="1" w:color="0F3460"/>
+        </w:pBdr>
+      </w:pPr>
       <w:r>
         <w:rPr>
           <w:b/>
           <w:color w:val="0F3460"/>
-          <w:sz w:val="28"/>
+          <w:sz w:val="26"/>
         </w:rPr>
-        <w:t>PROJETS RÉALISÉS</w:t>
+        <w:t>PROJETS REALISES</w:t>
       </w:r>
-      <w:pBdr>
-        <w:bottom w:val="single" w:sz="6" w:space="1" w:color="0F3460"/>
-      </w:pBdr>
     </w:p>
     <w:p>
       <w:r>
@@ -287,7 +291,7 @@
           <w:color w:val="555555"/>
           <w:sz w:val="20"/>
         </w:rPr>
-        <w:t xml:space="preserve"> — Système de Gestion de Caisse</w:t>
+        <w:t xml:space="preserve"> — Systeme de Gestion de Caisse</w:t>
       </w:r>
     </w:p>
     <w:p>
@@ -320,7 +324,7 @@
         <w:rPr>
           <w:sz w:val="20"/>
         </w:rPr>
-        <w:t>Analyse de données intégrée (Pandas, NumPy) : CA, panier moyen, percentiles, tendances</w:t>
+        <w:t>Analyse de donnees integree (Pandas, NumPy) : CA, panier moyen, tendances</w:t>
       </w:r>
     </w:p>
     <w:p>
@@ -369,7 +373,7 @@
         <w:rPr>
           <w:sz w:val="20"/>
         </w:rPr>
-        <w:t>Algorithme TF-IDF + similarité cosinus pour le matching intelligent</w:t>
+        <w:t>Algorithme TF-IDF + similarite cosinus pour le matching intelligent</w:t>
       </w:r>
     </w:p>
     <w:p>
@@ -380,7 +384,7 @@
         <w:rPr>
           <w:sz w:val="20"/>
         </w:rPr>
-        <w:t>Interface React (SPA) déployée sur Vercel</w:t>
+        <w:t>Interface React (SPA) deployee sur Vercel</w:t>
       </w:r>
     </w:p>
     <w:p>
@@ -402,7 +406,7 @@
         <w:rPr>
           <w:sz w:val="20"/>
         </w:rPr>
-        <w:t>Base PostgreSQL hébergée sur Neon.tech</w:t>
+        <w:t>Base PostgreSQL hebergee sur Neon.tech</w:t>
       </w:r>
     </w:p>
     <w:p>
@@ -420,14 +424,87 @@
       <w:r>
         <w:rPr>
           <w:b/>
+          <w:sz w:val="22"/>
+        </w:rPr>
+        <w:t>vibetodev</w:t>
+      </w:r>
+      <w:r>
+        <w:rPr>
+          <w:color w:val="555555"/>
+          <w:sz w:val="20"/>
+        </w:rPr>
+        <w:t xml:space="preserve"> — Package Python publie sur PyPI</w:t>
+      </w:r>
+    </w:p>
+    <w:p>
+      <w:pPr>
+        <w:pStyle w:val="ListBullet"/>
+      </w:pPr>
+      <w:r>
+        <w:rPr>
+          <w:sz w:val="20"/>
+        </w:rPr>
+        <w:t>Analyse AST de projets Python pour extraire les concepts de programmation</w:t>
+      </w:r>
+    </w:p>
+    <w:p>
+      <w:pPr>
+        <w:pStyle w:val="ListBullet"/>
+      </w:pPr>
+      <w:r>
+        <w:rPr>
+          <w:sz w:val="20"/>
+        </w:rPr>
+        <w:t>Categorisation en 9 modules pedagogiques (debutant a avance)</w:t>
+      </w:r>
+    </w:p>
+    <w:p>
+      <w:pPr>
+        <w:pStyle w:val="ListBullet"/>
+      </w:pPr>
+      <w:r>
+        <w:rPr>
+          <w:sz w:val="20"/>
+        </w:rPr>
+        <w:t>Generation automatique de vault Obsidian avec lecons et exercices</w:t>
+      </w:r>
+    </w:p>
+    <w:p>
+      <w:pPr>
+        <w:pStyle w:val="ListBullet"/>
+      </w:pPr>
+      <w:r>
+        <w:rPr>
+          <w:sz w:val="20"/>
+        </w:rPr>
+        <w:t>Validation d'exercices par execution et feedback sans reveler la solution</w:t>
+      </w:r>
+    </w:p>
+    <w:p>
+      <w:pPr>
+        <w:pStyle w:val="ListBullet"/>
+      </w:pPr>
+      <w:r>
+        <w:rPr>
+          <w:sz w:val="20"/>
+        </w:rPr>
+        <w:t>Installable via pip install vibetodev — pypi.org/project/vibetodev</w:t>
+      </w:r>
+    </w:p>
+    <w:p>
+      <w:pPr>
+        <w:pBdr>
+          <w:bottom w:val="single" w:sz="6" w:space="1" w:color="0F3460"/>
+        </w:pBdr>
+      </w:pPr>
+      <w:r>
+        <w:rPr>
+          <w:b/>
           <w:color w:val="0F3460"/>
-          <w:sz w:val="28"/>
+          <w:sz w:val="26"/>
         </w:rPr>
-        <w:t>COMPÉTENCES TECHNIQUES</w:t>
+        <w:t>COMPETENCES TECHNIQUES</w:t>
       </w:r>
-      <w:pBdr>
-        <w:bottom w:val="single" w:sz="6" w:space="1" w:color="0F3460"/>
-      </w:pBdr>
     </w:p>
     <w:tbl>
       <w:tblPr>
@@ -436,8 +513,8 @@
         <w:tblLook w:firstColumn="1" w:firstRow="1" w:lastColumn="0" w:lastRow="0" w:noHBand="0" w:noVBand="1" w:val="04A0"/>
       </w:tblPr>
       <w:tblGrid>
-        <w:gridCol w:w="4819"/>
-        <w:gridCol w:w="4819"/>
+        <w:gridCol w:w="4153"/>
+        <w:gridCol w:w="4153"/>
       </w:tblGrid>
       <w:tr>
         <w:tc>
@@ -462,7 +539,7 @@
         </w:tc>
         <w:tc>
           <w:tcPr>
-            <w:tcW w:type="dxa" w:w="4819"/>
+            <w:tcW w:type="dxa" w:w="4153"/>
             <w:tcBorders>
               <w:top w:val="nil"/>
               <w:left w:val="nil"/>
@@ -503,7 +580,7 @@
         </w:tc>
         <w:tc>
           <w:tcPr>
-            <w:tcW w:type="dxa" w:w="4819"/>
+            <w:tcW w:type="dxa" w:w="4153"/>
             <w:tcBorders>
               <w:top w:val="nil"/>
               <w:left w:val="nil"/>
@@ -538,13 +615,13 @@
                 <w:b/>
                 <w:sz w:val="20"/>
               </w:rPr>
-              <w:t>Bases de données</w:t>
+              <w:t>Bases de donnees</w:t>
             </w:r>
           </w:p>
         </w:tc>
         <w:tc>
           <w:tcPr>
-            <w:tcW w:type="dxa" w:w="4819"/>
+            <w:tcW w:type="dxa" w:w="4153"/>
             <w:tcBorders>
               <w:top w:val="nil"/>
               <w:left w:val="nil"/>
@@ -585,7 +662,7 @@
         </w:tc>
         <w:tc>
           <w:tcPr>
-            <w:tcW w:type="dxa" w:w="4819"/>
+            <w:tcW w:type="dxa" w:w="4153"/>
             <w:tcBorders>
               <w:top w:val="nil"/>
               <w:left w:val="nil"/>
@@ -626,7 +703,7 @@
         </w:tc>
         <w:tc>
           <w:tcPr>
-            <w:tcW w:type="dxa" w:w="4819"/>
+            <w:tcW w:type="dxa" w:w="4153"/>
             <w:tcBorders>
               <w:top w:val="nil"/>
               <w:left w:val="nil"/>
@@ -646,17 +723,19 @@
       </w:tr>
     </w:tbl>
     <w:p>
+      <w:pPr>
+        <w:pBdr>
+          <w:bottom w:val="single" w:sz="6" w:space="1" w:color="0F3460"/>
+        </w:pBdr>
+      </w:pPr>
       <w:r>
         <w:rPr>
           <w:b/>
           <w:color w:val="0F3460"/>
-          <w:sz w:val="28"/>
+          <w:sz w:val="26"/>
         </w:rPr>
         <w:t>LANGUES</w:t>
       </w:r>
-      <w:pBdr>
-        <w:bottom w:val="single" w:sz="6" w:space="1" w:color="0F3460"/>
-      </w:pBdr>
     </w:p>
     <w:p>
       <w:r>
@@ -664,7 +743,7 @@
           <w:b/>
           <w:sz w:val="20"/>
         </w:rPr>
-        <w:t xml:space="preserve">Français : </w:t>
+        <w:t xml:space="preserve">Francais : </w:t>
       </w:r>
       <w:r>
         <w:rPr>
@@ -685,21 +764,23 @@
         <w:rPr>
           <w:sz w:val="20"/>
         </w:rPr>
-        <w:t>Intermédiaire avancé (certificat SFA)</w:t>
+        <w:t>Intermediaire avance (certificat SFA)</w:t>
       </w:r>
     </w:p>
     <w:p>
+      <w:pPr>
+        <w:pBdr>
+          <w:bottom w:val="single" w:sz="6" w:space="1" w:color="0F3460"/>
+        </w:pBdr>
+      </w:pPr>
       <w:r>
         <w:rPr>
           <w:b/>
           <w:color w:val="0F3460"/>
-          <w:sz w:val="28"/>
+          <w:sz w:val="26"/>
         </w:rPr>
-        <w:t>CENTRES D'INTÉRÊT</w:t>
+        <w:t>CENTRES D'INTERET</w:t>
       </w:r>
-      <w:pBdr>
-        <w:bottom w:val="single" w:sz="6" w:space="1" w:color="0F3460"/>
-      </w:pBdr>
     </w:p>
     <w:p>
       <w:pPr>
@@ -720,7 +801,7 @@
         <w:rPr>
           <w:sz w:val="20"/>
         </w:rPr>
-        <w:t>Développement d'applications web et mobiles</w:t>
+        <w:t>Developpement d'applications web et mobiles</w:t>
       </w:r>
     </w:p>
     <w:p>
@@ -731,7 +812,7 @@
         <w:rPr>
           <w:sz w:val="20"/>
         </w:rPr>
-        <w:t>Veille technologique et innovation numérique</w:t>
+        <w:t>Veille technologique et innovation numerique</w:t>
       </w:r>
     </w:p>
     <w:p>
@@ -746,17 +827,19 @@
       </w:r>
     </w:p>
     <w:p>
+      <w:pPr>
+        <w:pBdr>
+          <w:bottom w:val="single" w:sz="6" w:space="1" w:color="0F3460"/>
+        </w:pBdr>
+      </w:pPr>
       <w:r>
         <w:rPr>
           <w:b/>
           <w:color w:val="0F3460"/>
-          <w:sz w:val="28"/>
+          <w:sz w:val="26"/>
         </w:rPr>
-        <w:t>RÉFÉRENCES</w:t>
+        <w:t>REFERENCES</w:t>
       </w:r>
-      <w:pBdr>
-        <w:bottom w:val="single" w:sz="6" w:space="1" w:color="0F3460"/>
-      </w:pBdr>
     </w:p>
     <w:p>
       <w:r>
@@ -790,7 +873,7 @@
     </w:p>
     <w:sectPr>
       <w:pgSz w:w="11906" w:h="16838"/>
-      <w:pgMar w:top="850" w:right="1134" w:bottom="850" w:left="1134" w:header="720" w:footer="720" w:gutter="0"/>
+      <w:pgMar w:top="1440" w:right="1800" w:bottom="1440" w:left="1800" w:header="720" w:footer="720" w:gutter="0"/>
       <w:cols w:space="720"/>
       <w:docGrid w:linePitch="360"/>
     </w:sectPr>

</xml_diff>